<commit_message>
Fix time column mapping to Time64, which Delta Lake cannot store
Committing a `time` column failed table creation outright with
`Invalid data type for Delta Lake: Time64(us)`, since Delta has no
time-of-day type. No existing test committed a time column through the
real Delta write path, only through the Arrow builder in isolation,
which is why this went unnoticed.

Maps `time` to Utf8 instead, kept as its unescaped literal text,
consistent with this crate's text-preservation policy for other
non-representable types (interval, jsonb, arrays). `time` stays
`recognised: true` and so does not appear in `text_fallback_columns`:
the type is understood, it is Delta that cannot store it.

Adds regression tests confirming the underlying Delta rejection and
an end-to-end commit of a time column as text, and updates the type
mapping in CLAUDE.md and docs/architecture.md (regenerated .docx).

Co-Authored-By: Claude Sonnet 5 <noreply@anthropic.com>
</commit_message>
<xml_diff>
--- a/docs/architecture.docx
+++ b/docs/architecture.docx
@@ -7373,7 +7373,14 @@
                 <w:rFonts w:ascii="Consolas" w:hAnsi="Consolas" w:eastAsia="Consolas"/>
                 <w:sz w:val="18"/>
               </w:rPr>
-              <w:t>Time64(Micros)</w:t>
+              <w:t>Utf8</w:t>
+            </w:r>
+            <w:r>
+              <w:rPr>
+                <w:rFonts w:ascii="Times New Roman" w:hAnsi="Times New Roman" w:eastAsia="Batang"/>
+                <w:sz w:val="22"/>
+              </w:rPr>
+              <w:t>, always (§2)</w:t>
             </w:r>
           </w:p>
         </w:tc>
@@ -7730,6 +7737,111 @@
           <w:sz w:val="22"/>
         </w:rPr>
         <w:t xml:space="preserve"> instead. See Section 2.</w:t>
+      </w:r>
+    </w:p>
+    <w:p>
+      <w:pPr>
+        <w:spacing w:line="384" w:lineRule="auto" w:after="120"/>
+        <w:jc w:val="both"/>
+      </w:pPr>
+      <w:r>
+        <w:rPr>
+          <w:rFonts w:ascii="Consolas" w:hAnsi="Consolas" w:eastAsia="Consolas"/>
+          <w:sz w:val="18"/>
+        </w:rPr>
+        <w:t>time</w:t>
+      </w:r>
+      <w:r>
+        <w:rPr>
+          <w:rFonts w:ascii="Times New Roman" w:hAnsi="Times New Roman" w:eastAsia="Batang"/>
+          <w:sz w:val="22"/>
+        </w:rPr>
+        <w:t xml:space="preserve"> is retained as its literal text for a different reason: Delta Lake has no time-of-day type at all. Arrow's own </w:t>
+      </w:r>
+      <w:r>
+        <w:rPr>
+          <w:rFonts w:ascii="Consolas" w:hAnsi="Consolas" w:eastAsia="Consolas"/>
+          <w:sz w:val="18"/>
+        </w:rPr>
+        <w:t>Time64</w:t>
+      </w:r>
+      <w:r>
+        <w:rPr>
+          <w:rFonts w:ascii="Times New Roman" w:hAnsi="Times New Roman" w:eastAsia="Batang"/>
+          <w:sz w:val="22"/>
+        </w:rPr>
+        <w:t xml:space="preserve"> exists and the builder side of this library once used it, but handing that type to Delta fails table creation outright with </w:t>
+      </w:r>
+      <w:r>
+        <w:rPr>
+          <w:rFonts w:ascii="Consolas" w:hAnsi="Consolas" w:eastAsia="Consolas"/>
+          <w:sz w:val="18"/>
+        </w:rPr>
+        <w:t>Schema error: Invalid data type for Delta Lake: Time64(µs)</w:t>
+      </w:r>
+      <w:r>
+        <w:rPr>
+          <w:rFonts w:ascii="Times New Roman" w:hAnsi="Times New Roman" w:eastAsia="Batang"/>
+          <w:sz w:val="22"/>
+        </w:rPr>
+        <w:t xml:space="preserve">, so this is not a stylistic choice the way </w:t>
+      </w:r>
+      <w:r>
+        <w:rPr>
+          <w:rFonts w:ascii="Consolas" w:hAnsi="Consolas" w:eastAsia="Consolas"/>
+          <w:sz w:val="18"/>
+        </w:rPr>
+        <w:t>interval</w:t>
+      </w:r>
+      <w:r>
+        <w:rPr>
+          <w:rFonts w:ascii="Times New Roman" w:hAnsi="Times New Roman" w:eastAsia="Batang"/>
+          <w:sz w:val="22"/>
+        </w:rPr>
+        <w:t xml:space="preserve"> is, it is the only option. </w:t>
+      </w:r>
+      <w:r>
+        <w:rPr>
+          <w:rFonts w:ascii="Consolas" w:hAnsi="Consolas" w:eastAsia="Consolas"/>
+          <w:sz w:val="18"/>
+        </w:rPr>
+        <w:t>time</w:t>
+      </w:r>
+      <w:r>
+        <w:rPr>
+          <w:rFonts w:ascii="Times New Roman" w:hAnsi="Times New Roman" w:eastAsia="Batang"/>
+          <w:sz w:val="22"/>
+        </w:rPr>
+        <w:t xml:space="preserve"> still counts as a </w:t>
+      </w:r>
+      <w:r>
+        <w:rPr>
+          <w:rFonts w:ascii="Times New Roman" w:hAnsi="Times New Roman" w:eastAsia="Batang"/>
+          <w:b/>
+          <w:sz w:val="22"/>
+        </w:rPr>
+        <w:t>recognised</w:t>
+      </w:r>
+      <w:r>
+        <w:rPr>
+          <w:rFonts w:ascii="Times New Roman" w:hAnsi="Times New Roman" w:eastAsia="Batang"/>
+          <w:sz w:val="22"/>
+        </w:rPr>
+        <w:t xml:space="preserve"> type in the run statistics; the fallback to text is Delta's limitation, not type uncertainty, so it does not appear alongside genuinely unrecognised types. See Section 2 for the value-level consequence: unlike an unrecognised type, a </w:t>
+      </w:r>
+      <w:r>
+        <w:rPr>
+          <w:rFonts w:ascii="Consolas" w:hAnsi="Consolas" w:eastAsia="Consolas"/>
+          <w:sz w:val="18"/>
+        </w:rPr>
+        <w:t>time</w:t>
+      </w:r>
+      <w:r>
+        <w:rPr>
+          <w:rFonts w:ascii="Times New Roman" w:hAnsi="Times New Roman" w:eastAsia="Batang"/>
+          <w:sz w:val="22"/>
+        </w:rPr>
+        <w:t xml:space="preserve"> value is not re-validated on this path, since PostgreSQL already validated it once, on the way into the dump.</w:t>
       </w:r>
     </w:p>
     <w:p>

</xml_diff>